<commit_message>
Comprehensive update: Mini template fixes, font sizing improvements, and UI enhancements
- Fixed mini DOH placeholder issue in template processor
- Enhanced mini font sizing system for better readability
- Updated unified font sizing with improved algorithms
- Enhanced docx formatting with better cell handling
- Updated UI components and splash screens
- Added comprehensive documentation and test files
- Improved template handling and generation processes
- Enhanced CSS styling and JavaScript functionality
</commit_message>
<xml_diff>
--- a/src/core/generation/templates/mini.docx
+++ b/src/core/generation/templates/mini.docx
@@ -7,7 +7,7 @@
         <w:tblStyle w:val="TableGrid"/>
         <w:tblpPr w:horzAnchor="margin" w:tblpXSpec="center" w:tblpY="303"/>
         <w:tblOverlap w:val="never"/>
-        <w:tblW w:w="2520" w:type="dxa"/>
+        <w:tblW w:w="2160" w:type="dxa"/>
         <w:tblBorders>
           <w:insideH w:val="none" w:sz="0" w:space="0" w:color="auto"/>
           <w:insideV w:val="none" w:sz="0" w:space="0" w:color="auto"/>
@@ -20,12 +20,12 @@
         <w:tblLook w:val="0000" w:firstRow="0" w:lastRow="0" w:firstColumn="0" w:lastColumn="0" w:noHBand="0" w:noVBand="0"/>
       </w:tblPr>
       <w:tblGrid>
-        <w:gridCol w:w="2520"/>
+        <w:gridCol w:w="2160"/>
       </w:tblGrid>
       <w:tr>
         <w:trPr>
           <w:cantSplit/>
-          <w:trHeight w:hRule="exact" w:val="2880"/>
+          <w:trHeight w:hRule="exact" w:val="2160"/>
         </w:trPr>
         <w:tc>
           <w:tcPr>
@@ -37,8 +37,8 @@
           <w:tbl>
             <w:tblPr>
               <w:tblStyle w:val="TableGrid"/>
-              <w:tblpPr w:leftFromText="187" w:rightFromText="187" w:vertAnchor="text" w:tblpXSpec="center" w:tblpY="1"/>
-              <w:tblW w:w="2511" w:type="dxa"/>
+              <w:tblW w:w="2284" w:type="dxa"/>
+              <w:jc w:val="center"/>
               <w:tblCellMar>
                 <w:left w:w="0" w:type="dxa"/>
                 <w:right w:w="0" w:type="dxa"/>
@@ -46,15 +46,17 @@
               <w:tblLook w:val="04A0" w:firstRow="1" w:lastRow="0" w:firstColumn="1" w:lastColumn="0" w:noHBand="0" w:noVBand="1"/>
             </w:tblPr>
             <w:tblGrid>
-              <w:gridCol w:w="2511"/>
+              <w:gridCol w:w="2284"/>
             </w:tblGrid>
             <w:tr>
               <w:trPr>
-                <w:trHeight w:hRule="exact" w:val="1720"/>
+                <w:cantSplit/>
+                <w:trHeight w:hRule="exact" w:val="1084"/>
+                <w:jc w:val="center"/>
               </w:trPr>
               <w:tc>
                 <w:tcPr>
-                  <w:tcW w:w="2511" w:type="dxa"/>
+                  <w:tcW w:w="2284" w:type="dxa"/>
                   <w:tcBorders>
                     <w:top w:val="nil"/>
                     <w:left w:val="nil"/>
@@ -70,8 +72,10 @@
                 </w:tcPr>
                 <w:p>
                   <w:pPr>
+                    <w:framePr w:wrap="around" w:hAnchor="margin" w:xAlign="center" w:y="303"/>
                     <w:spacing w:line="216" w:lineRule="auto"/>
                     <w:ind w:right="101"/>
+                    <w:suppressOverlap/>
                     <w:rPr>
                       <w:rFonts w:ascii="Arial" w:hAnsi="Arial" w:cs="Arial"/>
                       <w:b/>
@@ -119,7 +123,7 @@
               <w:tblStyle w:val="TableGrid"/>
               <w:tblpPr w:leftFromText="187" w:rightFromText="187" w:vertAnchor="page" w:horzAnchor="margin" w:tblpY="2155"/>
               <w:tblOverlap w:val="never"/>
-              <w:tblW w:w="2520" w:type="dxa"/>
+              <w:tblW w:w="2153" w:type="dxa"/>
               <w:tblBorders>
                 <w:top w:val="none" w:sz="0" w:space="0" w:color="auto"/>
                 <w:left w:val="none" w:sz="0" w:space="0" w:color="auto"/>
@@ -132,17 +136,17 @@
               <w:tblLook w:val="04A0" w:firstRow="1" w:lastRow="0" w:firstColumn="1" w:lastColumn="0" w:noHBand="0" w:noVBand="1"/>
             </w:tblPr>
             <w:tblGrid>
-              <w:gridCol w:w="900"/>
-              <w:gridCol w:w="720"/>
-              <w:gridCol w:w="900"/>
+              <w:gridCol w:w="692"/>
+              <w:gridCol w:w="538"/>
+              <w:gridCol w:w="923"/>
             </w:tblGrid>
             <w:tr>
               <w:trPr>
-                <w:trHeight w:val="716"/>
+                <w:trHeight w:val="689"/>
               </w:trPr>
               <w:tc>
                 <w:tcPr>
-                  <w:tcW w:w="900" w:type="dxa"/>
+                  <w:tcW w:w="692" w:type="dxa"/>
                   <w:shd w:val="clear" w:color="auto" w:fill="CCCCCC"/>
                   <w:vAlign w:val="center"/>
                 </w:tcPr>
@@ -168,7 +172,7 @@
               </w:tc>
               <w:tc>
                 <w:tcPr>
-                  <w:tcW w:w="720" w:type="dxa"/>
+                  <w:tcW w:w="538" w:type="dxa"/>
                   <w:shd w:val="clear" w:color="auto" w:fill="CCCCCC"/>
                   <w:vAlign w:val="center"/>
                 </w:tcPr>
@@ -192,7 +196,7 @@
               </w:tc>
               <w:tc>
                 <w:tcPr>
-                  <w:tcW w:w="900" w:type="dxa"/>
+                  <w:tcW w:w="923" w:type="dxa"/>
                   <w:shd w:val="clear" w:color="auto" w:fill="CCCCCC"/>
                   <w:vAlign w:val="center"/>
                 </w:tcPr>

</xml_diff>

<commit_message>
Fix mini template Product Brand centering and THC_CBD font sizing issues
- Fix Product Brand centering in mini templates by using PRODUCTBRAND_CENTER markers
- Apply centering before marker cleanup to ensure proper alignment
- Fix THC_CBD content receiving ratio font sizing instead of proper THC_CBD spacing
- Enhance ratio content detection to differentiate between THC/CBD and actual ratios
- Respect unified font sizing system line spacing values
- Mini template now uses 1.3 line spacing for THC_CBD and 1.0 for actual ratios
</commit_message>
<xml_diff>
--- a/src/core/generation/templates/mini.docx
+++ b/src/core/generation/templates/mini.docx
@@ -51,7 +51,7 @@
             <w:tr>
               <w:trPr>
                 <w:cantSplit/>
-                <w:trHeight w:hRule="exact" w:val="1084"/>
+                <w:trHeight w:hRule="exact" w:val="1176"/>
                 <w:jc w:val="center"/>
               </w:trPr>
               <w:tc>
@@ -136,17 +136,18 @@
               <w:tblLook w:val="04A0" w:firstRow="1" w:lastRow="0" w:firstColumn="1" w:lastColumn="0" w:noHBand="0" w:noVBand="1"/>
             </w:tblPr>
             <w:tblGrid>
-              <w:gridCol w:w="692"/>
-              <w:gridCol w:w="538"/>
-              <w:gridCol w:w="923"/>
+              <w:gridCol w:w="810"/>
+              <w:gridCol w:w="540"/>
+              <w:gridCol w:w="803"/>
             </w:tblGrid>
             <w:tr>
               <w:trPr>
-                <w:trHeight w:val="689"/>
+                <w:cantSplit/>
+                <w:trHeight w:hRule="exact" w:val="632"/>
               </w:trPr>
               <w:tc>
                 <w:tcPr>
-                  <w:tcW w:w="692" w:type="dxa"/>
+                  <w:tcW w:w="810" w:type="dxa"/>
                   <w:shd w:val="clear" w:color="auto" w:fill="CCCCCC"/>
                   <w:vAlign w:val="center"/>
                 </w:tcPr>
@@ -172,7 +173,7 @@
               </w:tc>
               <w:tc>
                 <w:tcPr>
-                  <w:tcW w:w="538" w:type="dxa"/>
+                  <w:tcW w:w="540" w:type="dxa"/>
                   <w:shd w:val="clear" w:color="auto" w:fill="CCCCCC"/>
                   <w:vAlign w:val="center"/>
                 </w:tcPr>
@@ -196,7 +197,7 @@
               </w:tc>
               <w:tc>
                 <w:tcPr>
-                  <w:tcW w:w="923" w:type="dxa"/>
+                  <w:tcW w:w="803" w:type="dxa"/>
                   <w:shd w:val="clear" w:color="auto" w:fill="CCCCCC"/>
                   <w:vAlign w:val="center"/>
                 </w:tcPr>

</xml_diff>

<commit_message>
Fix mini template labels - use Label1, Label2, etc. format for proper expansion
</commit_message>
<xml_diff>
--- a/src/core/generation/templates/mini.docx
+++ b/src/core/generation/templates/mini.docx
@@ -44,7 +44,7 @@
                 <w:b/>
                 <w:sz w:val="20"/>
               </w:rPr>
-              <w:t>{{1.ProductStrain}}</w:t>
+              <w:t>{{Label1.ProductStrain}}</w:t>
             </w:r>
             <w:r>
               <w:br/>
@@ -60,7 +60,7 @@
                 <w:b/>
                 <w:sz w:val="20"/>
               </w:rPr>
-              <w:t>{{1.ProductBrand}}</w:t>
+              <w:t>{{Label1.ProductBrand}}</w:t>
             </w:r>
             <w:r>
               <w:br/>
@@ -76,7 +76,7 @@
                 <w:b/>
                 <w:sz w:val="20"/>
               </w:rPr>
-              <w:t>{{1.VendorInfo}}</w:t>
+              <w:t>{{Label1.VendorInfo}}</w:t>
             </w:r>
             <w:r>
               <w:br/>
@@ -92,7 +92,7 @@
                 <w:b/>
                 <w:sz w:val="20"/>
               </w:rPr>
-              <w:t>{{1.Price}}</w:t>
+              <w:t>{{Label1.Price}}</w:t>
             </w:r>
             <w:r>
               <w:br/>
@@ -108,7 +108,7 @@
                 <w:b/>
                 <w:sz w:val="20"/>
               </w:rPr>
-              <w:t>{{1.Ratio_or_THC_CBD}}</w:t>
+              <w:t>{{Label1.Ratio_or_THC_CBD}}</w:t>
             </w:r>
             <w:r>
               <w:br/>
@@ -124,7 +124,7 @@
                 <w:b/>
                 <w:sz w:val="20"/>
               </w:rPr>
-              <w:t>{{1.Lineage}}</w:t>
+              <w:t>{{Label1.Lineage}}</w:t>
             </w:r>
           </w:p>
         </w:tc>
@@ -142,7 +142,7 @@
                 <w:b/>
                 <w:sz w:val="20"/>
               </w:rPr>
-              <w:t>{{2.ProductStrain}}</w:t>
+              <w:t>{{Label2.ProductStrain}}</w:t>
             </w:r>
             <w:r>
               <w:br/>
@@ -158,7 +158,7 @@
                 <w:b/>
                 <w:sz w:val="20"/>
               </w:rPr>
-              <w:t>{{2.ProductBrand}}</w:t>
+              <w:t>{{Label2.ProductBrand}}</w:t>
             </w:r>
             <w:r>
               <w:br/>
@@ -174,7 +174,7 @@
                 <w:b/>
                 <w:sz w:val="20"/>
               </w:rPr>
-              <w:t>{{2.VendorInfo}}</w:t>
+              <w:t>{{Label2.VendorInfo}}</w:t>
             </w:r>
             <w:r>
               <w:br/>
@@ -190,7 +190,7 @@
                 <w:b/>
                 <w:sz w:val="20"/>
               </w:rPr>
-              <w:t>{{2.Price}}</w:t>
+              <w:t>{{Label2.Price}}</w:t>
             </w:r>
             <w:r>
               <w:br/>
@@ -206,7 +206,7 @@
                 <w:b/>
                 <w:sz w:val="20"/>
               </w:rPr>
-              <w:t>{{2.Ratio_or_THC_CBD}}</w:t>
+              <w:t>{{Label2.Ratio_or_THC_CBD}}</w:t>
             </w:r>
             <w:r>
               <w:br/>
@@ -222,7 +222,7 @@
                 <w:b/>
                 <w:sz w:val="20"/>
               </w:rPr>
-              <w:t>{{2.Lineage}}</w:t>
+              <w:t>{{Label2.Lineage}}</w:t>
             </w:r>
           </w:p>
         </w:tc>
@@ -240,7 +240,7 @@
                 <w:b/>
                 <w:sz w:val="20"/>
               </w:rPr>
-              <w:t>{{3.ProductStrain}}</w:t>
+              <w:t>{{Label3.ProductStrain}}</w:t>
             </w:r>
             <w:r>
               <w:br/>
@@ -256,7 +256,7 @@
                 <w:b/>
                 <w:sz w:val="20"/>
               </w:rPr>
-              <w:t>{{3.ProductBrand}}</w:t>
+              <w:t>{{Label3.ProductBrand}}</w:t>
             </w:r>
             <w:r>
               <w:br/>
@@ -272,7 +272,7 @@
                 <w:b/>
                 <w:sz w:val="20"/>
               </w:rPr>
-              <w:t>{{3.VendorInfo}}</w:t>
+              <w:t>{{Label3.VendorInfo}}</w:t>
             </w:r>
             <w:r>
               <w:br/>
@@ -288,7 +288,7 @@
                 <w:b/>
                 <w:sz w:val="20"/>
               </w:rPr>
-              <w:t>{{3.Price}}</w:t>
+              <w:t>{{Label3.Price}}</w:t>
             </w:r>
             <w:r>
               <w:br/>
@@ -304,7 +304,7 @@
                 <w:b/>
                 <w:sz w:val="20"/>
               </w:rPr>
-              <w:t>{{3.Ratio_or_THC_CBD}}</w:t>
+              <w:t>{{Label3.Ratio_or_THC_CBD}}</w:t>
             </w:r>
             <w:r>
               <w:br/>
@@ -320,7 +320,7 @@
                 <w:b/>
                 <w:sz w:val="20"/>
               </w:rPr>
-              <w:t>{{3.Lineage}}</w:t>
+              <w:t>{{Label3.Lineage}}</w:t>
             </w:r>
           </w:p>
         </w:tc>
@@ -338,7 +338,7 @@
                 <w:b/>
                 <w:sz w:val="20"/>
               </w:rPr>
-              <w:t>{{4.ProductStrain}}</w:t>
+              <w:t>{{Label4.ProductStrain}}</w:t>
             </w:r>
             <w:r>
               <w:br/>
@@ -354,7 +354,7 @@
                 <w:b/>
                 <w:sz w:val="20"/>
               </w:rPr>
-              <w:t>{{4.ProductBrand}}</w:t>
+              <w:t>{{Label4.ProductBrand}}</w:t>
             </w:r>
             <w:r>
               <w:br/>
@@ -370,7 +370,7 @@
                 <w:b/>
                 <w:sz w:val="20"/>
               </w:rPr>
-              <w:t>{{4.VendorInfo}}</w:t>
+              <w:t>{{Label4.VendorInfo}}</w:t>
             </w:r>
             <w:r>
               <w:br/>
@@ -386,7 +386,7 @@
                 <w:b/>
                 <w:sz w:val="20"/>
               </w:rPr>
-              <w:t>{{4.Price}}</w:t>
+              <w:t>{{Label4.Price}}</w:t>
             </w:r>
             <w:r>
               <w:br/>
@@ -402,7 +402,7 @@
                 <w:b/>
                 <w:sz w:val="20"/>
               </w:rPr>
-              <w:t>{{4.Ratio_or_THC_CBD}}</w:t>
+              <w:t>{{Label4.Ratio_or_THC_CBD}}</w:t>
             </w:r>
             <w:r>
               <w:br/>
@@ -418,7 +418,7 @@
                 <w:b/>
                 <w:sz w:val="20"/>
               </w:rPr>
-              <w:t>{{4.Lineage}}</w:t>
+              <w:t>{{Label4.Lineage}}</w:t>
             </w:r>
           </w:p>
         </w:tc>
@@ -438,7 +438,7 @@
                 <w:b/>
                 <w:sz w:val="20"/>
               </w:rPr>
-              <w:t>{{5.ProductStrain}}</w:t>
+              <w:t>{{Label5.ProductStrain}}</w:t>
             </w:r>
             <w:r>
               <w:br/>
@@ -454,7 +454,7 @@
                 <w:b/>
                 <w:sz w:val="20"/>
               </w:rPr>
-              <w:t>{{5.ProductBrand}}</w:t>
+              <w:t>{{Label5.ProductBrand}}</w:t>
             </w:r>
             <w:r>
               <w:br/>
@@ -470,7 +470,7 @@
                 <w:b/>
                 <w:sz w:val="20"/>
               </w:rPr>
-              <w:t>{{5.VendorInfo}}</w:t>
+              <w:t>{{Label5.VendorInfo}}</w:t>
             </w:r>
             <w:r>
               <w:br/>
@@ -486,7 +486,7 @@
                 <w:b/>
                 <w:sz w:val="20"/>
               </w:rPr>
-              <w:t>{{5.Price}}</w:t>
+              <w:t>{{Label5.Price}}</w:t>
             </w:r>
             <w:r>
               <w:br/>
@@ -502,7 +502,7 @@
                 <w:b/>
                 <w:sz w:val="20"/>
               </w:rPr>
-              <w:t>{{5.Ratio_or_THC_CBD}}</w:t>
+              <w:t>{{Label5.Ratio_or_THC_CBD}}</w:t>
             </w:r>
             <w:r>
               <w:br/>
@@ -518,7 +518,7 @@
                 <w:b/>
                 <w:sz w:val="20"/>
               </w:rPr>
-              <w:t>{{5.Lineage}}</w:t>
+              <w:t>{{Label5.Lineage}}</w:t>
             </w:r>
           </w:p>
         </w:tc>
@@ -536,7 +536,7 @@
                 <w:b/>
                 <w:sz w:val="20"/>
               </w:rPr>
-              <w:t>{{6.ProductStrain}}</w:t>
+              <w:t>{{Label6.ProductStrain}}</w:t>
             </w:r>
             <w:r>
               <w:br/>
@@ -552,7 +552,7 @@
                 <w:b/>
                 <w:sz w:val="20"/>
               </w:rPr>
-              <w:t>{{6.ProductBrand}}</w:t>
+              <w:t>{{Label6.ProductBrand}}</w:t>
             </w:r>
             <w:r>
               <w:br/>
@@ -568,7 +568,7 @@
                 <w:b/>
                 <w:sz w:val="20"/>
               </w:rPr>
-              <w:t>{{6.VendorInfo}}</w:t>
+              <w:t>{{Label6.VendorInfo}}</w:t>
             </w:r>
             <w:r>
               <w:br/>
@@ -584,7 +584,7 @@
                 <w:b/>
                 <w:sz w:val="20"/>
               </w:rPr>
-              <w:t>{{6.Price}}</w:t>
+              <w:t>{{Label6.Price}}</w:t>
             </w:r>
             <w:r>
               <w:br/>
@@ -600,7 +600,7 @@
                 <w:b/>
                 <w:sz w:val="20"/>
               </w:rPr>
-              <w:t>{{6.Ratio_or_THC_CBD}}</w:t>
+              <w:t>{{Label6.Ratio_or_THC_CBD}}</w:t>
             </w:r>
             <w:r>
               <w:br/>
@@ -616,7 +616,7 @@
                 <w:b/>
                 <w:sz w:val="20"/>
               </w:rPr>
-              <w:t>{{6.Lineage}}</w:t>
+              <w:t>{{Label6.Lineage}}</w:t>
             </w:r>
           </w:p>
         </w:tc>
@@ -634,7 +634,7 @@
                 <w:b/>
                 <w:sz w:val="20"/>
               </w:rPr>
-              <w:t>{{7.ProductStrain}}</w:t>
+              <w:t>{{Label7.ProductStrain}}</w:t>
             </w:r>
             <w:r>
               <w:br/>
@@ -650,7 +650,7 @@
                 <w:b/>
                 <w:sz w:val="20"/>
               </w:rPr>
-              <w:t>{{7.ProductBrand}}</w:t>
+              <w:t>{{Label7.ProductBrand}}</w:t>
             </w:r>
             <w:r>
               <w:br/>
@@ -666,7 +666,7 @@
                 <w:b/>
                 <w:sz w:val="20"/>
               </w:rPr>
-              <w:t>{{7.VendorInfo}}</w:t>
+              <w:t>{{Label7.VendorInfo}}</w:t>
             </w:r>
             <w:r>
               <w:br/>
@@ -682,7 +682,7 @@
                 <w:b/>
                 <w:sz w:val="20"/>
               </w:rPr>
-              <w:t>{{7.Price}}</w:t>
+              <w:t>{{Label7.Price}}</w:t>
             </w:r>
             <w:r>
               <w:br/>
@@ -698,7 +698,7 @@
                 <w:b/>
                 <w:sz w:val="20"/>
               </w:rPr>
-              <w:t>{{7.Ratio_or_THC_CBD}}</w:t>
+              <w:t>{{Label7.Ratio_or_THC_CBD}}</w:t>
             </w:r>
             <w:r>
               <w:br/>
@@ -714,7 +714,7 @@
                 <w:b/>
                 <w:sz w:val="20"/>
               </w:rPr>
-              <w:t>{{7.Lineage}}</w:t>
+              <w:t>{{Label7.Lineage}}</w:t>
             </w:r>
           </w:p>
         </w:tc>
@@ -732,7 +732,7 @@
                 <w:b/>
                 <w:sz w:val="20"/>
               </w:rPr>
-              <w:t>{{8.ProductStrain}}</w:t>
+              <w:t>{{Label8.ProductStrain}}</w:t>
             </w:r>
             <w:r>
               <w:br/>
@@ -748,7 +748,7 @@
                 <w:b/>
                 <w:sz w:val="20"/>
               </w:rPr>
-              <w:t>{{8.ProductBrand}}</w:t>
+              <w:t>{{Label8.ProductBrand}}</w:t>
             </w:r>
             <w:r>
               <w:br/>
@@ -764,7 +764,7 @@
                 <w:b/>
                 <w:sz w:val="20"/>
               </w:rPr>
-              <w:t>{{8.VendorInfo}}</w:t>
+              <w:t>{{Label8.VendorInfo}}</w:t>
             </w:r>
             <w:r>
               <w:br/>
@@ -780,7 +780,7 @@
                 <w:b/>
                 <w:sz w:val="20"/>
               </w:rPr>
-              <w:t>{{8.Price}}</w:t>
+              <w:t>{{Label8.Price}}</w:t>
             </w:r>
             <w:r>
               <w:br/>
@@ -796,7 +796,7 @@
                 <w:b/>
                 <w:sz w:val="20"/>
               </w:rPr>
-              <w:t>{{8.Ratio_or_THC_CBD}}</w:t>
+              <w:t>{{Label8.Ratio_or_THC_CBD}}</w:t>
             </w:r>
             <w:r>
               <w:br/>
@@ -812,7 +812,7 @@
                 <w:b/>
                 <w:sz w:val="20"/>
               </w:rPr>
-              <w:t>{{8.Lineage}}</w:t>
+              <w:t>{{Label8.Lineage}}</w:t>
             </w:r>
           </w:p>
         </w:tc>
@@ -832,7 +832,7 @@
                 <w:b/>
                 <w:sz w:val="20"/>
               </w:rPr>
-              <w:t>{{9.ProductStrain}}</w:t>
+              <w:t>{{Label9.ProductStrain}}</w:t>
             </w:r>
             <w:r>
               <w:br/>
@@ -848,7 +848,7 @@
                 <w:b/>
                 <w:sz w:val="20"/>
               </w:rPr>
-              <w:t>{{9.ProductBrand}}</w:t>
+              <w:t>{{Label9.ProductBrand}}</w:t>
             </w:r>
             <w:r>
               <w:br/>
@@ -864,7 +864,7 @@
                 <w:b/>
                 <w:sz w:val="20"/>
               </w:rPr>
-              <w:t>{{9.VendorInfo}}</w:t>
+              <w:t>{{Label9.VendorInfo}}</w:t>
             </w:r>
             <w:r>
               <w:br/>
@@ -880,7 +880,7 @@
                 <w:b/>
                 <w:sz w:val="20"/>
               </w:rPr>
-              <w:t>{{9.Price}}</w:t>
+              <w:t>{{Label9.Price}}</w:t>
             </w:r>
             <w:r>
               <w:br/>
@@ -896,7 +896,7 @@
                 <w:b/>
                 <w:sz w:val="20"/>
               </w:rPr>
-              <w:t>{{9.Ratio_or_THC_CBD}}</w:t>
+              <w:t>{{Label9.Ratio_or_THC_CBD}}</w:t>
             </w:r>
             <w:r>
               <w:br/>
@@ -912,7 +912,7 @@
                 <w:b/>
                 <w:sz w:val="20"/>
               </w:rPr>
-              <w:t>{{9.Lineage}}</w:t>
+              <w:t>{{Label9.Lineage}}</w:t>
             </w:r>
           </w:p>
         </w:tc>
@@ -930,7 +930,7 @@
                 <w:b/>
                 <w:sz w:val="20"/>
               </w:rPr>
-              <w:t>{{10.ProductStrain}}</w:t>
+              <w:t>{{Label10.ProductStrain}}</w:t>
             </w:r>
             <w:r>
               <w:br/>
@@ -946,7 +946,7 @@
                 <w:b/>
                 <w:sz w:val="20"/>
               </w:rPr>
-              <w:t>{{10.ProductBrand}}</w:t>
+              <w:t>{{Label10.ProductBrand}}</w:t>
             </w:r>
             <w:r>
               <w:br/>
@@ -962,7 +962,7 @@
                 <w:b/>
                 <w:sz w:val="20"/>
               </w:rPr>
-              <w:t>{{10.VendorInfo}}</w:t>
+              <w:t>{{Label10.VendorInfo}}</w:t>
             </w:r>
             <w:r>
               <w:br/>
@@ -978,7 +978,7 @@
                 <w:b/>
                 <w:sz w:val="20"/>
               </w:rPr>
-              <w:t>{{10.Price}}</w:t>
+              <w:t>{{Label10.Price}}</w:t>
             </w:r>
             <w:r>
               <w:br/>
@@ -994,7 +994,7 @@
                 <w:b/>
                 <w:sz w:val="20"/>
               </w:rPr>
-              <w:t>{{10.Ratio_or_THC_CBD}}</w:t>
+              <w:t>{{Label10.Ratio_or_THC_CBD}}</w:t>
             </w:r>
             <w:r>
               <w:br/>
@@ -1010,7 +1010,7 @@
                 <w:b/>
                 <w:sz w:val="20"/>
               </w:rPr>
-              <w:t>{{10.Lineage}}</w:t>
+              <w:t>{{Label10.Lineage}}</w:t>
             </w:r>
           </w:p>
         </w:tc>
@@ -1028,7 +1028,7 @@
                 <w:b/>
                 <w:sz w:val="20"/>
               </w:rPr>
-              <w:t>{{11.ProductStrain}}</w:t>
+              <w:t>{{Label11.ProductStrain}}</w:t>
             </w:r>
             <w:r>
               <w:br/>
@@ -1044,7 +1044,7 @@
                 <w:b/>
                 <w:sz w:val="20"/>
               </w:rPr>
-              <w:t>{{11.ProductBrand}}</w:t>
+              <w:t>{{Label11.ProductBrand}}</w:t>
             </w:r>
             <w:r>
               <w:br/>
@@ -1060,7 +1060,7 @@
                 <w:b/>
                 <w:sz w:val="20"/>
               </w:rPr>
-              <w:t>{{11.VendorInfo}}</w:t>
+              <w:t>{{Label11.VendorInfo}}</w:t>
             </w:r>
             <w:r>
               <w:br/>
@@ -1076,7 +1076,7 @@
                 <w:b/>
                 <w:sz w:val="20"/>
               </w:rPr>
-              <w:t>{{11.Price}}</w:t>
+              <w:t>{{Label11.Price}}</w:t>
             </w:r>
             <w:r>
               <w:br/>
@@ -1092,7 +1092,7 @@
                 <w:b/>
                 <w:sz w:val="20"/>
               </w:rPr>
-              <w:t>{{11.Ratio_or_THC_CBD}}</w:t>
+              <w:t>{{Label11.Ratio_or_THC_CBD}}</w:t>
             </w:r>
             <w:r>
               <w:br/>
@@ -1108,7 +1108,7 @@
                 <w:b/>
                 <w:sz w:val="20"/>
               </w:rPr>
-              <w:t>{{11.Lineage}}</w:t>
+              <w:t>{{Label11.Lineage}}</w:t>
             </w:r>
           </w:p>
         </w:tc>
@@ -1126,7 +1126,7 @@
                 <w:b/>
                 <w:sz w:val="20"/>
               </w:rPr>
-              <w:t>{{12.ProductStrain}}</w:t>
+              <w:t>{{Label12.ProductStrain}}</w:t>
             </w:r>
             <w:r>
               <w:br/>
@@ -1142,7 +1142,7 @@
                 <w:b/>
                 <w:sz w:val="20"/>
               </w:rPr>
-              <w:t>{{12.ProductBrand}}</w:t>
+              <w:t>{{Label12.ProductBrand}}</w:t>
             </w:r>
             <w:r>
               <w:br/>
@@ -1158,7 +1158,7 @@
                 <w:b/>
                 <w:sz w:val="20"/>
               </w:rPr>
-              <w:t>{{12.VendorInfo}}</w:t>
+              <w:t>{{Label12.VendorInfo}}</w:t>
             </w:r>
             <w:r>
               <w:br/>
@@ -1174,7 +1174,7 @@
                 <w:b/>
                 <w:sz w:val="20"/>
               </w:rPr>
-              <w:t>{{12.Price}}</w:t>
+              <w:t>{{Label12.Price}}</w:t>
             </w:r>
             <w:r>
               <w:br/>
@@ -1190,7 +1190,7 @@
                 <w:b/>
                 <w:sz w:val="20"/>
               </w:rPr>
-              <w:t>{{12.Ratio_or_THC_CBD}}</w:t>
+              <w:t>{{Label12.Ratio_or_THC_CBD}}</w:t>
             </w:r>
             <w:r>
               <w:br/>
@@ -1206,7 +1206,7 @@
                 <w:b/>
                 <w:sz w:val="20"/>
               </w:rPr>
-              <w:t>{{12.Lineage}}</w:t>
+              <w:t>{{Label12.Lineage}}</w:t>
             </w:r>
           </w:p>
         </w:tc>
@@ -1226,7 +1226,7 @@
                 <w:b/>
                 <w:sz w:val="20"/>
               </w:rPr>
-              <w:t>{{13.ProductStrain}}</w:t>
+              <w:t>{{Label13.ProductStrain}}</w:t>
             </w:r>
             <w:r>
               <w:br/>
@@ -1242,7 +1242,7 @@
                 <w:b/>
                 <w:sz w:val="20"/>
               </w:rPr>
-              <w:t>{{13.ProductBrand}}</w:t>
+              <w:t>{{Label13.ProductBrand}}</w:t>
             </w:r>
             <w:r>
               <w:br/>
@@ -1258,7 +1258,7 @@
                 <w:b/>
                 <w:sz w:val="20"/>
               </w:rPr>
-              <w:t>{{13.VendorInfo}}</w:t>
+              <w:t>{{Label13.VendorInfo}}</w:t>
             </w:r>
             <w:r>
               <w:br/>
@@ -1274,7 +1274,7 @@
                 <w:b/>
                 <w:sz w:val="20"/>
               </w:rPr>
-              <w:t>{{13.Price}}</w:t>
+              <w:t>{{Label13.Price}}</w:t>
             </w:r>
             <w:r>
               <w:br/>
@@ -1290,7 +1290,7 @@
                 <w:b/>
                 <w:sz w:val="20"/>
               </w:rPr>
-              <w:t>{{13.Ratio_or_THC_CBD}}</w:t>
+              <w:t>{{Label13.Ratio_or_THC_CBD}}</w:t>
             </w:r>
             <w:r>
               <w:br/>
@@ -1306,7 +1306,7 @@
                 <w:b/>
                 <w:sz w:val="20"/>
               </w:rPr>
-              <w:t>{{13.Lineage}}</w:t>
+              <w:t>{{Label13.Lineage}}</w:t>
             </w:r>
           </w:p>
         </w:tc>
@@ -1324,7 +1324,7 @@
                 <w:b/>
                 <w:sz w:val="20"/>
               </w:rPr>
-              <w:t>{{14.ProductStrain}}</w:t>
+              <w:t>{{Label14.ProductStrain}}</w:t>
             </w:r>
             <w:r>
               <w:br/>
@@ -1340,7 +1340,7 @@
                 <w:b/>
                 <w:sz w:val="20"/>
               </w:rPr>
-              <w:t>{{14.ProductBrand}}</w:t>
+              <w:t>{{Label14.ProductBrand}}</w:t>
             </w:r>
             <w:r>
               <w:br/>
@@ -1356,7 +1356,7 @@
                 <w:b/>
                 <w:sz w:val="20"/>
               </w:rPr>
-              <w:t>{{14.VendorInfo}}</w:t>
+              <w:t>{{Label14.VendorInfo}}</w:t>
             </w:r>
             <w:r>
               <w:br/>
@@ -1372,7 +1372,7 @@
                 <w:b/>
                 <w:sz w:val="20"/>
               </w:rPr>
-              <w:t>{{14.Price}}</w:t>
+              <w:t>{{Label14.Price}}</w:t>
             </w:r>
             <w:r>
               <w:br/>
@@ -1388,7 +1388,7 @@
                 <w:b/>
                 <w:sz w:val="20"/>
               </w:rPr>
-              <w:t>{{14.Ratio_or_THC_CBD}}</w:t>
+              <w:t>{{Label14.Ratio_or_THC_CBD}}</w:t>
             </w:r>
             <w:r>
               <w:br/>
@@ -1404,7 +1404,7 @@
                 <w:b/>
                 <w:sz w:val="20"/>
               </w:rPr>
-              <w:t>{{14.Lineage}}</w:t>
+              <w:t>{{Label14.Lineage}}</w:t>
             </w:r>
           </w:p>
         </w:tc>
@@ -1422,7 +1422,7 @@
                 <w:b/>
                 <w:sz w:val="20"/>
               </w:rPr>
-              <w:t>{{15.ProductStrain}}</w:t>
+              <w:t>{{Label15.ProductStrain}}</w:t>
             </w:r>
             <w:r>
               <w:br/>
@@ -1438,7 +1438,7 @@
                 <w:b/>
                 <w:sz w:val="20"/>
               </w:rPr>
-              <w:t>{{15.ProductBrand}}</w:t>
+              <w:t>{{Label15.ProductBrand}}</w:t>
             </w:r>
             <w:r>
               <w:br/>
@@ -1454,7 +1454,7 @@
                 <w:b/>
                 <w:sz w:val="20"/>
               </w:rPr>
-              <w:t>{{15.VendorInfo}}</w:t>
+              <w:t>{{Label15.VendorInfo}}</w:t>
             </w:r>
             <w:r>
               <w:br/>
@@ -1470,7 +1470,7 @@
                 <w:b/>
                 <w:sz w:val="20"/>
               </w:rPr>
-              <w:t>{{15.Price}}</w:t>
+              <w:t>{{Label15.Price}}</w:t>
             </w:r>
             <w:r>
               <w:br/>
@@ -1486,7 +1486,7 @@
                 <w:b/>
                 <w:sz w:val="20"/>
               </w:rPr>
-              <w:t>{{15.Ratio_or_THC_CBD}}</w:t>
+              <w:t>{{Label15.Ratio_or_THC_CBD}}</w:t>
             </w:r>
             <w:r>
               <w:br/>
@@ -1502,7 +1502,7 @@
                 <w:b/>
                 <w:sz w:val="20"/>
               </w:rPr>
-              <w:t>{{15.Lineage}}</w:t>
+              <w:t>{{Label15.Lineage}}</w:t>
             </w:r>
           </w:p>
         </w:tc>
@@ -1520,7 +1520,7 @@
                 <w:b/>
                 <w:sz w:val="20"/>
               </w:rPr>
-              <w:t>{{16.ProductStrain}}</w:t>
+              <w:t>{{Label16.ProductStrain}}</w:t>
             </w:r>
             <w:r>
               <w:br/>
@@ -1536,7 +1536,7 @@
                 <w:b/>
                 <w:sz w:val="20"/>
               </w:rPr>
-              <w:t>{{16.ProductBrand}}</w:t>
+              <w:t>{{Label16.ProductBrand}}</w:t>
             </w:r>
             <w:r>
               <w:br/>
@@ -1552,7 +1552,7 @@
                 <w:b/>
                 <w:sz w:val="20"/>
               </w:rPr>
-              <w:t>{{16.VendorInfo}}</w:t>
+              <w:t>{{Label16.VendorInfo}}</w:t>
             </w:r>
             <w:r>
               <w:br/>
@@ -1568,7 +1568,7 @@
                 <w:b/>
                 <w:sz w:val="20"/>
               </w:rPr>
-              <w:t>{{16.Price}}</w:t>
+              <w:t>{{Label16.Price}}</w:t>
             </w:r>
             <w:r>
               <w:br/>
@@ -1584,7 +1584,7 @@
                 <w:b/>
                 <w:sz w:val="20"/>
               </w:rPr>
-              <w:t>{{16.Ratio_or_THC_CBD}}</w:t>
+              <w:t>{{Label16.Ratio_or_THC_CBD}}</w:t>
             </w:r>
             <w:r>
               <w:br/>
@@ -1600,7 +1600,7 @@
                 <w:b/>
                 <w:sz w:val="20"/>
               </w:rPr>
-              <w:t>{{16.Lineage}}</w:t>
+              <w:t>{{Label16.Lineage}}</w:t>
             </w:r>
           </w:p>
         </w:tc>
@@ -1620,7 +1620,7 @@
                 <w:b/>
                 <w:sz w:val="20"/>
               </w:rPr>
-              <w:t>{{17.ProductStrain}}</w:t>
+              <w:t>{{Label17.ProductStrain}}</w:t>
             </w:r>
             <w:r>
               <w:br/>
@@ -1636,7 +1636,7 @@
                 <w:b/>
                 <w:sz w:val="20"/>
               </w:rPr>
-              <w:t>{{17.ProductBrand}}</w:t>
+              <w:t>{{Label17.ProductBrand}}</w:t>
             </w:r>
             <w:r>
               <w:br/>
@@ -1652,7 +1652,7 @@
                 <w:b/>
                 <w:sz w:val="20"/>
               </w:rPr>
-              <w:t>{{17.VendorInfo}}</w:t>
+              <w:t>{{Label17.VendorInfo}}</w:t>
             </w:r>
             <w:r>
               <w:br/>
@@ -1668,7 +1668,7 @@
                 <w:b/>
                 <w:sz w:val="20"/>
               </w:rPr>
-              <w:t>{{17.Price}}</w:t>
+              <w:t>{{Label17.Price}}</w:t>
             </w:r>
             <w:r>
               <w:br/>
@@ -1684,7 +1684,7 @@
                 <w:b/>
                 <w:sz w:val="20"/>
               </w:rPr>
-              <w:t>{{17.Ratio_or_THC_CBD}}</w:t>
+              <w:t>{{Label17.Ratio_or_THC_CBD}}</w:t>
             </w:r>
             <w:r>
               <w:br/>
@@ -1700,7 +1700,7 @@
                 <w:b/>
                 <w:sz w:val="20"/>
               </w:rPr>
-              <w:t>{{17.Lineage}}</w:t>
+              <w:t>{{Label17.Lineage}}</w:t>
             </w:r>
           </w:p>
         </w:tc>
@@ -1718,7 +1718,7 @@
                 <w:b/>
                 <w:sz w:val="20"/>
               </w:rPr>
-              <w:t>{{18.ProductStrain}}</w:t>
+              <w:t>{{Label18.ProductStrain}}</w:t>
             </w:r>
             <w:r>
               <w:br/>
@@ -1734,7 +1734,7 @@
                 <w:b/>
                 <w:sz w:val="20"/>
               </w:rPr>
-              <w:t>{{18.ProductBrand}}</w:t>
+              <w:t>{{Label18.ProductBrand}}</w:t>
             </w:r>
             <w:r>
               <w:br/>
@@ -1750,7 +1750,7 @@
                 <w:b/>
                 <w:sz w:val="20"/>
               </w:rPr>
-              <w:t>{{18.VendorInfo}}</w:t>
+              <w:t>{{Label18.VendorInfo}}</w:t>
             </w:r>
             <w:r>
               <w:br/>
@@ -1766,7 +1766,7 @@
                 <w:b/>
                 <w:sz w:val="20"/>
               </w:rPr>
-              <w:t>{{18.Price}}</w:t>
+              <w:t>{{Label18.Price}}</w:t>
             </w:r>
             <w:r>
               <w:br/>
@@ -1782,7 +1782,7 @@
                 <w:b/>
                 <w:sz w:val="20"/>
               </w:rPr>
-              <w:t>{{18.Ratio_or_THC_CBD}}</w:t>
+              <w:t>{{Label18.Ratio_or_THC_CBD}}</w:t>
             </w:r>
             <w:r>
               <w:br/>
@@ -1798,7 +1798,7 @@
                 <w:b/>
                 <w:sz w:val="20"/>
               </w:rPr>
-              <w:t>{{18.Lineage}}</w:t>
+              <w:t>{{Label18.Lineage}}</w:t>
             </w:r>
           </w:p>
         </w:tc>
@@ -1816,7 +1816,7 @@
                 <w:b/>
                 <w:sz w:val="20"/>
               </w:rPr>
-              <w:t>{{19.ProductStrain}}</w:t>
+              <w:t>{{Label19.ProductStrain}}</w:t>
             </w:r>
             <w:r>
               <w:br/>
@@ -1832,7 +1832,7 @@
                 <w:b/>
                 <w:sz w:val="20"/>
               </w:rPr>
-              <w:t>{{19.ProductBrand}}</w:t>
+              <w:t>{{Label19.ProductBrand}}</w:t>
             </w:r>
             <w:r>
               <w:br/>
@@ -1848,7 +1848,7 @@
                 <w:b/>
                 <w:sz w:val="20"/>
               </w:rPr>
-              <w:t>{{19.VendorInfo}}</w:t>
+              <w:t>{{Label19.VendorInfo}}</w:t>
             </w:r>
             <w:r>
               <w:br/>
@@ -1864,7 +1864,7 @@
                 <w:b/>
                 <w:sz w:val="20"/>
               </w:rPr>
-              <w:t>{{19.Price}}</w:t>
+              <w:t>{{Label19.Price}}</w:t>
             </w:r>
             <w:r>
               <w:br/>
@@ -1880,7 +1880,7 @@
                 <w:b/>
                 <w:sz w:val="20"/>
               </w:rPr>
-              <w:t>{{19.Ratio_or_THC_CBD}}</w:t>
+              <w:t>{{Label19.Ratio_or_THC_CBD}}</w:t>
             </w:r>
             <w:r>
               <w:br/>
@@ -1896,7 +1896,7 @@
                 <w:b/>
                 <w:sz w:val="20"/>
               </w:rPr>
-              <w:t>{{19.Lineage}}</w:t>
+              <w:t>{{Label19.Lineage}}</w:t>
             </w:r>
           </w:p>
         </w:tc>
@@ -1914,7 +1914,7 @@
                 <w:b/>
                 <w:sz w:val="20"/>
               </w:rPr>
-              <w:t>{{20.ProductStrain}}</w:t>
+              <w:t>{{Label20.ProductStrain}}</w:t>
             </w:r>
             <w:r>
               <w:br/>
@@ -1930,7 +1930,7 @@
                 <w:b/>
                 <w:sz w:val="20"/>
               </w:rPr>
-              <w:t>{{20.ProductBrand}}</w:t>
+              <w:t>{{Label20.ProductBrand}}</w:t>
             </w:r>
             <w:r>
               <w:br/>
@@ -1946,7 +1946,7 @@
                 <w:b/>
                 <w:sz w:val="20"/>
               </w:rPr>
-              <w:t>{{20.VendorInfo}}</w:t>
+              <w:t>{{Label20.VendorInfo}}</w:t>
             </w:r>
             <w:r>
               <w:br/>
@@ -1962,7 +1962,7 @@
                 <w:b/>
                 <w:sz w:val="20"/>
               </w:rPr>
-              <w:t>{{20.Price}}</w:t>
+              <w:t>{{Label20.Price}}</w:t>
             </w:r>
             <w:r>
               <w:br/>
@@ -1978,7 +1978,7 @@
                 <w:b/>
                 <w:sz w:val="20"/>
               </w:rPr>
-              <w:t>{{20.Ratio_or_THC_CBD}}</w:t>
+              <w:t>{{Label20.Ratio_or_THC_CBD}}</w:t>
             </w:r>
             <w:r>
               <w:br/>
@@ -1994,7 +1994,7 @@
                 <w:b/>
                 <w:sz w:val="20"/>
               </w:rPr>
-              <w:t>{{20.Lineage}}</w:t>
+              <w:t>{{Label20.Lineage}}</w:t>
             </w:r>
           </w:p>
         </w:tc>

</xml_diff>

<commit_message>
Update font sizing, templates, and JavaScript files
</commit_message>
<xml_diff>
--- a/src/core/generation/templates/mini.docx
+++ b/src/core/generation/templates/mini.docx
@@ -50,7 +50,7 @@
             </w:tblGrid>
             <w:tr>
               <w:trPr>
-                <w:trHeight w:val="1258"/>
+                <w:trHeight w:val="972"/>
               </w:trPr>
               <w:tc>
                 <w:tcPr>
@@ -117,7 +117,50 @@
           <w:tbl>
             <w:tblPr>
               <w:tblStyle w:val="TableGrid"/>
-              <w:tblpPr w:leftFromText="187" w:rightFromText="187" w:vertAnchor="page" w:horzAnchor="margin" w:tblpY="2094"/>
+              <w:tblW w:w="2269" w:type="dxa"/>
+              <w:jc w:val="center"/>
+              <w:tblLook w:val="04A0" w:firstRow="1" w:lastRow="0" w:firstColumn="1" w:lastColumn="0" w:noHBand="0" w:noVBand="1"/>
+            </w:tblPr>
+            <w:tblGrid>
+              <w:gridCol w:w="2269"/>
+            </w:tblGrid>
+            <w:tr>
+              <w:trPr>
+                <w:trHeight w:val="101"/>
+                <w:jc w:val="center"/>
+              </w:trPr>
+              <w:tc>
+                <w:tcPr>
+                  <w:tcW w:w="2269" w:type="dxa"/>
+                  <w:vAlign w:val="center"/>
+                </w:tcPr>
+                <w:p>
+                  <w:pPr>
+                    <w:framePr w:wrap="around" w:hAnchor="margin" w:xAlign="center" w:y="303"/>
+                    <w:suppressOverlap/>
+                    <w:rPr>
+                      <w:sz w:val="15"/>
+                      <w:szCs w:val="15"/>
+                    </w:rPr>
+                  </w:pPr>
+                  <w:r>
+                    <w:rPr>
+                      <w:rFonts w:ascii="Arial" w:hAnsi="Arial" w:cs="Arial"/>
+                      <w:b/>
+                      <w:bCs/>
+                      <w:sz w:val="15"/>
+                      <w:szCs w:val="15"/>
+                    </w:rPr>
+                    <w:t>{{Label1.ProductBrand}}</w:t>
+                  </w:r>
+                </w:p>
+              </w:tc>
+            </w:tr>
+          </w:tbl>
+          <w:tbl>
+            <w:tblPr>
+              <w:tblStyle w:val="TableGrid"/>
+              <w:tblpPr w:leftFromText="187" w:rightFromText="187" w:vertAnchor="page" w:horzAnchor="margin" w:tblpY="1325"/>
               <w:tblOverlap w:val="never"/>
               <w:tblW w:w="2160" w:type="dxa"/>
               <w:tblBorders>
@@ -132,17 +175,16 @@
               <w:tblLook w:val="04A0" w:firstRow="1" w:lastRow="0" w:firstColumn="1" w:lastColumn="0" w:noHBand="0" w:noVBand="1"/>
             </w:tblPr>
             <w:tblGrid>
-              <w:gridCol w:w="900"/>
-              <w:gridCol w:w="504"/>
-              <w:gridCol w:w="756"/>
+              <w:gridCol w:w="1080"/>
+              <w:gridCol w:w="1080"/>
             </w:tblGrid>
             <w:tr>
               <w:trPr>
-                <w:trHeight w:hRule="exact" w:val="576"/>
+                <w:trHeight w:hRule="exact" w:val="813"/>
               </w:trPr>
               <w:tc>
                 <w:tcPr>
-                  <w:tcW w:w="900" w:type="dxa"/>
+                  <w:tcW w:w="1080" w:type="dxa"/>
                   <w:shd w:val="clear" w:color="auto" w:fill="CCCCCC"/>
                   <w:vAlign w:val="center"/>
                 </w:tcPr>
@@ -168,35 +210,7 @@
               </w:tc>
               <w:tc>
                 <w:tcPr>
-                  <w:tcW w:w="504" w:type="dxa"/>
-                  <w:shd w:val="clear" w:color="auto" w:fill="CCCCCC"/>
-                  <w:tcMar>
-                    <w:left w:w="29" w:type="dxa"/>
-                    <w:right w:w="29" w:type="dxa"/>
-                  </w:tcMar>
-                  <w:vAlign w:val="center"/>
-                </w:tcPr>
-                <w:p>
-                  <w:pPr>
-                    <w:rPr>
-                      <w:sz w:val="13"/>
-                      <w:szCs w:val="13"/>
-                    </w:rPr>
-                  </w:pPr>
-                  <w:r>
-                    <w:rPr>
-                      <w:b/>
-                      <w:bCs/>
-                      <w:sz w:val="13"/>
-                      <w:szCs w:val="13"/>
-                    </w:rPr>
-                    <w:t>{{Label1.DOH }}</w:t>
-                  </w:r>
-                </w:p>
-              </w:tc>
-              <w:tc>
-                <w:tcPr>
-                  <w:tcW w:w="756" w:type="dxa"/>
+                  <w:tcW w:w="1080" w:type="dxa"/>
                   <w:shd w:val="clear" w:color="auto" w:fill="CCCCCC"/>
                   <w:tcMar>
                     <w:left w:w="29" w:type="dxa"/>
@@ -240,48 +254,6 @@
                       <w:szCs w:val="13"/>
                     </w:rPr>
                     <w:t>}}</w:t>
-                  </w:r>
-                </w:p>
-              </w:tc>
-            </w:tr>
-          </w:tbl>
-          <w:tbl>
-            <w:tblPr>
-              <w:tblStyle w:val="TableGrid"/>
-              <w:tblW w:w="0" w:type="auto"/>
-              <w:jc w:val="center"/>
-              <w:tblLook w:val="04A0" w:firstRow="1" w:lastRow="0" w:firstColumn="1" w:lastColumn="0" w:noHBand="0" w:noVBand="1"/>
-            </w:tblPr>
-            <w:tblGrid>
-              <w:gridCol w:w="2120"/>
-            </w:tblGrid>
-            <w:tr>
-              <w:trPr>
-                <w:jc w:val="center"/>
-              </w:trPr>
-              <w:tc>
-                <w:tcPr>
-                  <w:tcW w:w="2120" w:type="dxa"/>
-                  <w:vAlign w:val="center"/>
-                </w:tcPr>
-                <w:p>
-                  <w:pPr>
-                    <w:framePr w:wrap="around" w:hAnchor="margin" w:xAlign="center" w:y="303"/>
-                    <w:suppressOverlap/>
-                    <w:rPr>
-                      <w:sz w:val="2"/>
-                      <w:szCs w:val="2"/>
-                    </w:rPr>
-                  </w:pPr>
-                  <w:r>
-                    <w:rPr>
-                      <w:rFonts w:ascii="Arial" w:hAnsi="Arial" w:cs="Arial"/>
-                      <w:b/>
-                      <w:bCs/>
-                      <w:sz w:val="16"/>
-                      <w:szCs w:val="16"/>
-                    </w:rPr>
-                    <w:t>{{Label1.ProductBrand}}</w:t>
                   </w:r>
                 </w:p>
               </w:tc>

</xml_diff>

<commit_message>
Update codebase with latest changes
</commit_message>
<xml_diff>
--- a/src/core/generation/templates/mini.docx
+++ b/src/core/generation/templates/mini.docx
@@ -50,7 +50,7 @@
             </w:tblGrid>
             <w:tr>
               <w:trPr>
-                <w:trHeight w:val="972"/>
+                <w:trHeight w:val="1258"/>
               </w:trPr>
               <w:tc>
                 <w:tcPr>
@@ -117,50 +117,7 @@
           <w:tbl>
             <w:tblPr>
               <w:tblStyle w:val="TableGrid"/>
-              <w:tblW w:w="2269" w:type="dxa"/>
-              <w:jc w:val="center"/>
-              <w:tblLook w:val="04A0" w:firstRow="1" w:lastRow="0" w:firstColumn="1" w:lastColumn="0" w:noHBand="0" w:noVBand="1"/>
-            </w:tblPr>
-            <w:tblGrid>
-              <w:gridCol w:w="2269"/>
-            </w:tblGrid>
-            <w:tr>
-              <w:trPr>
-                <w:trHeight w:val="101"/>
-                <w:jc w:val="center"/>
-              </w:trPr>
-              <w:tc>
-                <w:tcPr>
-                  <w:tcW w:w="2269" w:type="dxa"/>
-                  <w:vAlign w:val="center"/>
-                </w:tcPr>
-                <w:p>
-                  <w:pPr>
-                    <w:framePr w:wrap="around" w:hAnchor="margin" w:xAlign="center" w:y="303"/>
-                    <w:suppressOverlap/>
-                    <w:rPr>
-                      <w:sz w:val="15"/>
-                      <w:szCs w:val="15"/>
-                    </w:rPr>
-                  </w:pPr>
-                  <w:r>
-                    <w:rPr>
-                      <w:rFonts w:ascii="Arial" w:hAnsi="Arial" w:cs="Arial"/>
-                      <w:b/>
-                      <w:bCs/>
-                      <w:sz w:val="15"/>
-                      <w:szCs w:val="15"/>
-                    </w:rPr>
-                    <w:t>{{Label1.ProductBrand}}</w:t>
-                  </w:r>
-                </w:p>
-              </w:tc>
-            </w:tr>
-          </w:tbl>
-          <w:tbl>
-            <w:tblPr>
-              <w:tblStyle w:val="TableGrid"/>
-              <w:tblpPr w:leftFromText="187" w:rightFromText="187" w:vertAnchor="page" w:horzAnchor="margin" w:tblpY="1325"/>
+              <w:tblpPr w:leftFromText="187" w:rightFromText="187" w:vertAnchor="page" w:horzAnchor="margin" w:tblpY="2094"/>
               <w:tblOverlap w:val="never"/>
               <w:tblW w:w="2160" w:type="dxa"/>
               <w:tblBorders>
@@ -175,16 +132,17 @@
               <w:tblLook w:val="04A0" w:firstRow="1" w:lastRow="0" w:firstColumn="1" w:lastColumn="0" w:noHBand="0" w:noVBand="1"/>
             </w:tblPr>
             <w:tblGrid>
-              <w:gridCol w:w="1080"/>
-              <w:gridCol w:w="1080"/>
+              <w:gridCol w:w="900"/>
+              <w:gridCol w:w="504"/>
+              <w:gridCol w:w="756"/>
             </w:tblGrid>
             <w:tr>
               <w:trPr>
-                <w:trHeight w:hRule="exact" w:val="813"/>
+                <w:trHeight w:hRule="exact" w:val="576"/>
               </w:trPr>
               <w:tc>
                 <w:tcPr>
-                  <w:tcW w:w="1080" w:type="dxa"/>
+                  <w:tcW w:w="900" w:type="dxa"/>
                   <w:shd w:val="clear" w:color="auto" w:fill="CCCCCC"/>
                   <w:vAlign w:val="center"/>
                 </w:tcPr>
@@ -210,7 +168,35 @@
               </w:tc>
               <w:tc>
                 <w:tcPr>
-                  <w:tcW w:w="1080" w:type="dxa"/>
+                  <w:tcW w:w="504" w:type="dxa"/>
+                  <w:shd w:val="clear" w:color="auto" w:fill="CCCCCC"/>
+                  <w:tcMar>
+                    <w:left w:w="29" w:type="dxa"/>
+                    <w:right w:w="29" w:type="dxa"/>
+                  </w:tcMar>
+                  <w:vAlign w:val="center"/>
+                </w:tcPr>
+                <w:p>
+                  <w:pPr>
+                    <w:rPr>
+                      <w:sz w:val="13"/>
+                      <w:szCs w:val="13"/>
+                    </w:rPr>
+                  </w:pPr>
+                  <w:r>
+                    <w:rPr>
+                      <w:b/>
+                      <w:bCs/>
+                      <w:sz w:val="13"/>
+                      <w:szCs w:val="13"/>
+                    </w:rPr>
+                    <w:t>{{Label1.DOH }}</w:t>
+                  </w:r>
+                </w:p>
+              </w:tc>
+              <w:tc>
+                <w:tcPr>
+                  <w:tcW w:w="756" w:type="dxa"/>
                   <w:shd w:val="clear" w:color="auto" w:fill="CCCCCC"/>
                   <w:tcMar>
                     <w:left w:w="29" w:type="dxa"/>
@@ -254,6 +240,48 @@
                       <w:szCs w:val="13"/>
                     </w:rPr>
                     <w:t>}}</w:t>
+                  </w:r>
+                </w:p>
+              </w:tc>
+            </w:tr>
+          </w:tbl>
+          <w:tbl>
+            <w:tblPr>
+              <w:tblStyle w:val="TableGrid"/>
+              <w:tblW w:w="0" w:type="auto"/>
+              <w:jc w:val="center"/>
+              <w:tblLook w:val="04A0" w:firstRow="1" w:lastRow="0" w:firstColumn="1" w:lastColumn="0" w:noHBand="0" w:noVBand="1"/>
+            </w:tblPr>
+            <w:tblGrid>
+              <w:gridCol w:w="2120"/>
+            </w:tblGrid>
+            <w:tr>
+              <w:trPr>
+                <w:jc w:val="center"/>
+              </w:trPr>
+              <w:tc>
+                <w:tcPr>
+                  <w:tcW w:w="2120" w:type="dxa"/>
+                  <w:vAlign w:val="center"/>
+                </w:tcPr>
+                <w:p>
+                  <w:pPr>
+                    <w:framePr w:wrap="around" w:hAnchor="margin" w:xAlign="center" w:y="303"/>
+                    <w:suppressOverlap/>
+                    <w:rPr>
+                      <w:sz w:val="2"/>
+                      <w:szCs w:val="2"/>
+                    </w:rPr>
+                  </w:pPr>
+                  <w:r>
+                    <w:rPr>
+                      <w:rFonts w:ascii="Arial" w:hAnsi="Arial" w:cs="Arial"/>
+                      <w:b/>
+                      <w:bCs/>
+                      <w:sz w:val="16"/>
+                      <w:szCs w:val="16"/>
+                    </w:rPr>
+                    <w:t>{{Label1.ProductBrand}}</w:t>
                   </w:r>
                 </w:p>
               </w:tc>

</xml_diff>

<commit_message>
Update core functionality and UI improvements
</commit_message>
<xml_diff>
--- a/src/core/generation/templates/mini.docx
+++ b/src/core/generation/templates/mini.docx
@@ -50,7 +50,7 @@
             </w:tblGrid>
             <w:tr>
               <w:trPr>
-                <w:trHeight w:val="1258"/>
+                <w:trHeight w:val="972"/>
               </w:trPr>
               <w:tc>
                 <w:tcPr>
@@ -117,7 +117,50 @@
           <w:tbl>
             <w:tblPr>
               <w:tblStyle w:val="TableGrid"/>
-              <w:tblpPr w:leftFromText="187" w:rightFromText="187" w:vertAnchor="page" w:horzAnchor="margin" w:tblpY="2094"/>
+              <w:tblW w:w="2269" w:type="dxa"/>
+              <w:jc w:val="center"/>
+              <w:tblLook w:val="04A0" w:firstRow="1" w:lastRow="0" w:firstColumn="1" w:lastColumn="0" w:noHBand="0" w:noVBand="1"/>
+            </w:tblPr>
+            <w:tblGrid>
+              <w:gridCol w:w="2269"/>
+            </w:tblGrid>
+            <w:tr>
+              <w:trPr>
+                <w:trHeight w:val="101"/>
+                <w:jc w:val="center"/>
+              </w:trPr>
+              <w:tc>
+                <w:tcPr>
+                  <w:tcW w:w="2269" w:type="dxa"/>
+                  <w:vAlign w:val="center"/>
+                </w:tcPr>
+                <w:p>
+                  <w:pPr>
+                    <w:framePr w:wrap="around" w:hAnchor="margin" w:xAlign="center" w:y="303"/>
+                    <w:suppressOverlap/>
+                    <w:rPr>
+                      <w:sz w:val="15"/>
+                      <w:szCs w:val="15"/>
+                    </w:rPr>
+                  </w:pPr>
+                  <w:r>
+                    <w:rPr>
+                      <w:rFonts w:ascii="Arial" w:hAnsi="Arial" w:cs="Arial"/>
+                      <w:b/>
+                      <w:bCs/>
+                      <w:sz w:val="15"/>
+                      <w:szCs w:val="15"/>
+                    </w:rPr>
+                    <w:t>{{Label1.ProductBrand}}</w:t>
+                  </w:r>
+                </w:p>
+              </w:tc>
+            </w:tr>
+          </w:tbl>
+          <w:tbl>
+            <w:tblPr>
+              <w:tblStyle w:val="TableGrid"/>
+              <w:tblpPr w:leftFromText="187" w:rightFromText="187" w:vertAnchor="page" w:horzAnchor="margin" w:tblpY="1325"/>
               <w:tblOverlap w:val="never"/>
               <w:tblW w:w="2160" w:type="dxa"/>
               <w:tblBorders>
@@ -132,17 +175,16 @@
               <w:tblLook w:val="04A0" w:firstRow="1" w:lastRow="0" w:firstColumn="1" w:lastColumn="0" w:noHBand="0" w:noVBand="1"/>
             </w:tblPr>
             <w:tblGrid>
-              <w:gridCol w:w="900"/>
-              <w:gridCol w:w="504"/>
-              <w:gridCol w:w="756"/>
+              <w:gridCol w:w="1080"/>
+              <w:gridCol w:w="1080"/>
             </w:tblGrid>
             <w:tr>
               <w:trPr>
-                <w:trHeight w:hRule="exact" w:val="576"/>
+                <w:trHeight w:hRule="exact" w:val="813"/>
               </w:trPr>
               <w:tc>
                 <w:tcPr>
-                  <w:tcW w:w="900" w:type="dxa"/>
+                  <w:tcW w:w="1080" w:type="dxa"/>
                   <w:shd w:val="clear" w:color="auto" w:fill="CCCCCC"/>
                   <w:vAlign w:val="center"/>
                 </w:tcPr>
@@ -168,35 +210,7 @@
               </w:tc>
               <w:tc>
                 <w:tcPr>
-                  <w:tcW w:w="504" w:type="dxa"/>
-                  <w:shd w:val="clear" w:color="auto" w:fill="CCCCCC"/>
-                  <w:tcMar>
-                    <w:left w:w="29" w:type="dxa"/>
-                    <w:right w:w="29" w:type="dxa"/>
-                  </w:tcMar>
-                  <w:vAlign w:val="center"/>
-                </w:tcPr>
-                <w:p>
-                  <w:pPr>
-                    <w:rPr>
-                      <w:sz w:val="13"/>
-                      <w:szCs w:val="13"/>
-                    </w:rPr>
-                  </w:pPr>
-                  <w:r>
-                    <w:rPr>
-                      <w:b/>
-                      <w:bCs/>
-                      <w:sz w:val="13"/>
-                      <w:szCs w:val="13"/>
-                    </w:rPr>
-                    <w:t>{{Label1.DOH }}</w:t>
-                  </w:r>
-                </w:p>
-              </w:tc>
-              <w:tc>
-                <w:tcPr>
-                  <w:tcW w:w="756" w:type="dxa"/>
+                  <w:tcW w:w="1080" w:type="dxa"/>
                   <w:shd w:val="clear" w:color="auto" w:fill="CCCCCC"/>
                   <w:tcMar>
                     <w:left w:w="29" w:type="dxa"/>
@@ -240,48 +254,6 @@
                       <w:szCs w:val="13"/>
                     </w:rPr>
                     <w:t>}}</w:t>
-                  </w:r>
-                </w:p>
-              </w:tc>
-            </w:tr>
-          </w:tbl>
-          <w:tbl>
-            <w:tblPr>
-              <w:tblStyle w:val="TableGrid"/>
-              <w:tblW w:w="0" w:type="auto"/>
-              <w:jc w:val="center"/>
-              <w:tblLook w:val="04A0" w:firstRow="1" w:lastRow="0" w:firstColumn="1" w:lastColumn="0" w:noHBand="0" w:noVBand="1"/>
-            </w:tblPr>
-            <w:tblGrid>
-              <w:gridCol w:w="2120"/>
-            </w:tblGrid>
-            <w:tr>
-              <w:trPr>
-                <w:jc w:val="center"/>
-              </w:trPr>
-              <w:tc>
-                <w:tcPr>
-                  <w:tcW w:w="2120" w:type="dxa"/>
-                  <w:vAlign w:val="center"/>
-                </w:tcPr>
-                <w:p>
-                  <w:pPr>
-                    <w:framePr w:wrap="around" w:hAnchor="margin" w:xAlign="center" w:y="303"/>
-                    <w:suppressOverlap/>
-                    <w:rPr>
-                      <w:sz w:val="2"/>
-                      <w:szCs w:val="2"/>
-                    </w:rPr>
-                  </w:pPr>
-                  <w:r>
-                    <w:rPr>
-                      <w:rFonts w:ascii="Arial" w:hAnsi="Arial" w:cs="Arial"/>
-                      <w:b/>
-                      <w:bCs/>
-                      <w:sz w:val="16"/>
-                      <w:szCs w:val="16"/>
-                    </w:rPr>
-                    <w:t>{{Label1.ProductBrand}}</w:t>
                   </w:r>
                 </w:p>
               </w:tc>

</xml_diff>

<commit_message>
Perf: remove startup cache.clear() to fix slow tag loading
Removed aggressive cache clearing on server startup that was causing
30+ second tag load times. Flask caches now persist across restarts,
allowing instant loads from cached data while fresh data fetches in
background.

Co-Authored-By: Claude Opus 4.5 <noreply@anthropic.com>
</commit_message>
<xml_diff>
--- a/src/core/generation/templates/mini.docx
+++ b/src/core/generation/templates/mini.docx
@@ -7,11 +7,12 @@
         <w:tblStyle w:val="TableGrid"/>
         <w:tblpPr w:horzAnchor="margin" w:tblpXSpec="center" w:tblpY="303"/>
         <w:tblOverlap w:val="never"/>
+        <w:tblW w:w="2160" w:type="dxa"/>
         <w:tblBorders>
           <w:insideH w:val="none" w:sz="0" w:space="0" w:color="auto"/>
           <w:insideV w:val="none" w:sz="0" w:space="0" w:color="auto"/>
         </w:tblBorders>
-        <w:tblLayout w:type="autofit"/>
+        <w:tblLayout w:type="fixed"/>
         <w:tblCellMar>
           <w:left w:w="15" w:type="dxa"/>
           <w:right w:w="15" w:type="dxa"/>
@@ -19,7 +20,7 @@
         <w:tblLook w:val="0000" w:firstRow="0" w:lastRow="0" w:firstColumn="0" w:lastColumn="0" w:noHBand="0" w:noVBand="0"/>
       </w:tblPr>
       <w:tblGrid>
-        <w:gridCol/>
+        <w:gridCol w:w="2160"/>
       </w:tblGrid>
       <w:tr>
         <w:trPr>
@@ -28,6 +29,7 @@
         </w:trPr>
         <w:tc>
           <w:tcPr>
+            <w:tcW w:w="2160" w:type="dxa"/>
             <w:shd w:val="clear" w:color="auto" w:fill="13274B"/>
             <w:noWrap/>
             <w:vAlign w:val="center"/>
@@ -36,7 +38,7 @@
             <w:tblPr>
               <w:tblStyle w:val="TableGrid"/>
               <w:tblpPr w:leftFromText="187" w:rightFromText="187" w:vertAnchor="text" w:tblpXSpec="center" w:tblpY="1"/>
-              <w:tblW w:w="2137" w:type="dxa"/>
+              <w:tblW w:w="2160" w:type="dxa"/>
               <w:tblCellMar>
                 <w:left w:w="0" w:type="dxa"/>
                 <w:right w:w="0" w:type="dxa"/>
@@ -44,11 +46,12 @@
               <w:tblLook w:val="04A0" w:firstRow="1" w:lastRow="0" w:firstColumn="1" w:lastColumn="0" w:noHBand="0" w:noVBand="1"/>
             </w:tblPr>
             <w:tblGrid>
-              <w:gridCol w:w="2137"/>
+              <w:gridCol w:w="2160"/>
             </w:tblGrid>
             <w:tr>
               <w:trPr>
-                <w:trHeight w:val="1258"/>
+                <w:cantSplit/>
+                <w:trHeight w:hRule="exact" w:val="1181"/>
               </w:trPr>
               <w:tc>
                 <w:tcPr>
@@ -115,9 +118,10 @@
           <w:tbl>
             <w:tblPr>
               <w:tblStyle w:val="TableGrid"/>
-              <w:tblpPr w:leftFromText="187" w:rightFromText="187" w:vertAnchor="page" w:horzAnchor="margin" w:tblpY="2094"/>
+              <w:tblpPr w:leftFromText="187" w:rightFromText="187" w:vertAnchor="page" w:horzAnchor="margin" w:tblpXSpec="center" w:tblpY="1491"/>
               <w:tblOverlap w:val="never"/>
               <w:tblW w:w="2160" w:type="dxa"/>
+              <w:jc w:val="center"/>
               <w:tblBorders>
                 <w:top w:val="none" w:sz="0" w:space="0" w:color="auto"/>
                 <w:left w:val="none" w:sz="0" w:space="0" w:color="auto"/>
@@ -130,17 +134,19 @@
               <w:tblLook w:val="04A0" w:firstRow="1" w:lastRow="0" w:firstColumn="1" w:lastColumn="0" w:noHBand="0" w:noVBand="1"/>
             </w:tblPr>
             <w:tblGrid>
-              <w:gridCol w:w="900"/>
-              <w:gridCol w:w="504"/>
-              <w:gridCol w:w="756"/>
+              <w:gridCol w:w="890"/>
+              <w:gridCol w:w="562"/>
+              <w:gridCol w:w="708"/>
             </w:tblGrid>
             <w:tr>
               <w:trPr>
-                <w:trHeight w:hRule="exact" w:val="576"/>
+                <w:cantSplit/>
+                <w:trHeight w:hRule="exact" w:val="691"/>
+                <w:jc w:val="center"/>
               </w:trPr>
               <w:tc>
                 <w:tcPr>
-                  <w:tcW w:w="900" w:type="dxa"/>
+                  <w:tcW w:w="1008" w:type="dxa"/>
                   <w:shd w:val="clear" w:color="auto" w:fill="CCCCCC"/>
                   <w:vAlign w:val="center"/>
                 </w:tcPr>
@@ -166,7 +172,7 @@
               </w:tc>
               <w:tc>
                 <w:tcPr>
-                  <w:tcW w:w="504" w:type="dxa"/>
+                  <w:tcW w:w="648" w:type="dxa"/>
                   <w:shd w:val="clear" w:color="auto" w:fill="CCCCCC"/>
                   <w:tcMar>
                     <w:left w:w="29" w:type="dxa"/>
@@ -183,28 +189,44 @@
                   </w:pPr>
                   <w:r>
                     <w:rPr>
+                      <w:rFonts w:ascii="Arial" w:hAnsi="Arial" w:cs="Arial"/>
                       <w:b/>
                       <w:bCs/>
                       <w:sz w:val="13"/>
                       <w:szCs w:val="13"/>
                     </w:rPr>
-                    <w:t>{{Label1.DOH }}</w:t>
+                    <w:t>{{Label1.</w:t>
+                  </w:r>
+                  <w:r>
+                    <w:rPr>
+                      <w:rFonts w:ascii="Arial" w:hAnsi="Arial" w:cs="Arial"/>
+                      <w:b/>
+                      <w:bCs/>
+                      <w:sz w:val="13"/>
+                      <w:szCs w:val="13"/>
+                    </w:rPr>
+                    <w:t>DOH</w:t>
+                  </w:r>
+                  <w:r>
+                    <w:rPr>
+                      <w:rFonts w:ascii="Arial" w:hAnsi="Arial" w:cs="Arial"/>
+                      <w:b/>
+                      <w:bCs/>
+                      <w:sz w:val="13"/>
+                      <w:szCs w:val="13"/>
+                    </w:rPr>
+                    <w:t>}}</w:t>
                   </w:r>
                 </w:p>
               </w:tc>
               <w:tc>
                 <w:tcPr>
-                  <w:tcW w:w="756" w:type="dxa"/>
+                  <w:tcW w:w="792" w:type="dxa"/>
                   <w:shd w:val="clear" w:color="auto" w:fill="CCCCCC"/>
-                  <w:tcMar>
-                    <w:left w:w="29" w:type="dxa"/>
-                    <w:right w:w="29" w:type="dxa"/>
-                  </w:tcMar>
                   <w:vAlign w:val="center"/>
                 </w:tcPr>
                 <w:p>
                   <w:pPr>
-                    <w:jc w:val="center"/>
                     <w:rPr>
                       <w:sz w:val="13"/>
                       <w:szCs w:val="13"/>
@@ -244,48 +266,26 @@
               </w:tc>
             </w:tr>
           </w:tbl>
-          <w:tbl>
-            <w:tblPr>
-              <w:tblStyle w:val="TableGrid"/>
-              <w:tblW w:w="0" w:type="auto"/>
+          <w:p>
+            <w:pPr>
+              <w:spacing w:after="160" w:line="278" w:lineRule="auto"/>
               <w:jc w:val="center"/>
-              <w:tblLook w:val="04A0" w:firstRow="1" w:lastRow="0" w:firstColumn="1" w:lastColumn="0" w:noHBand="0" w:noVBand="1"/>
-            </w:tblPr>
-            <w:tblGrid>
-              <w:gridCol w:w="2120"/>
-            </w:tblGrid>
-            <w:tr>
-              <w:trPr>
-                <w:jc w:val="center"/>
-              </w:trPr>
-              <w:tc>
-                <w:tcPr>
-                  <w:tcW w:w="2120" w:type="dxa"/>
-                  <w:vAlign w:val="center"/>
-                </w:tcPr>
-                <w:p>
-                  <w:pPr>
-                    <w:framePr w:wrap="around" w:hAnchor="margin" w:xAlign="center" w:y="303"/>
-                    <w:suppressOverlap/>
-                    <w:rPr>
-                      <w:sz w:val="2"/>
-                      <w:szCs w:val="2"/>
-                    </w:rPr>
-                  </w:pPr>
-                  <w:r>
-                    <w:rPr>
-                      <w:rFonts w:ascii="Arial" w:hAnsi="Arial" w:cs="Arial"/>
-                      <w:b/>
-                      <w:bCs/>
-                      <w:sz w:val="16"/>
-                      <w:szCs w:val="16"/>
-                    </w:rPr>
-                    <w:t>{{Label1.ProductBrand}}</w:t>
-                  </w:r>
-                </w:p>
-              </w:tc>
-            </w:tr>
-          </w:tbl>
+              <w:rPr>
+                <w:sz w:val="15"/>
+                <w:szCs w:val="15"/>
+              </w:rPr>
+            </w:pPr>
+            <w:r>
+              <w:rPr>
+                <w:rFonts w:ascii="Arial" w:hAnsi="Arial" w:cs="Arial"/>
+                <w:b/>
+                <w:bCs/>
+                <w:sz w:val="15"/>
+                <w:szCs w:val="15"/>
+              </w:rPr>
+              <w:t>{{Label1.ProductBrand}}</w:t>
+            </w:r>
+          </w:p>
           <w:p>
             <w:pPr>
               <w:rPr>

</xml_diff>

<commit_message>
Refine label spacing and raise local memory limit
- Leave mini/preroll paragraph spacing to Word defaults to avoid over-tight labels.
- Increase local MAX_MEMORY_MB to reduce spurious server memory warnings during heavy Excel/JSON runs.
- Include latest database/json matching, template, and documentation reorganizations.

Co-authored-by: Cursor <cursoragent@cursor.com>
</commit_message>
<xml_diff>
--- a/src/core/generation/templates/mini.docx
+++ b/src/core/generation/templates/mini.docx
@@ -51,7 +51,7 @@
             <w:tr>
               <w:trPr>
                 <w:cantSplit/>
-                <w:trHeight w:hRule="exact" w:val="1181"/>
+                <w:trHeight w:hRule="exact" w:val="1210"/>
               </w:trPr>
               <w:tc>
                 <w:tcPr>
@@ -141,7 +141,7 @@
             <w:tr>
               <w:trPr>
                 <w:cantSplit/>
-                <w:trHeight w:hRule="exact" w:val="691"/>
+                <w:trHeight w:hRule="exact" w:val="662"/>
                 <w:jc w:val="center"/>
               </w:trPr>
               <w:tc>

</xml_diff>

<commit_message>
Set paragraph spacing to 3pt for double, vertical, preroll, and mini templates
Co-authored-by: Cursor <cursoragent@cursor.com>
</commit_message>
<xml_diff>
--- a/src/core/generation/templates/mini.docx
+++ b/src/core/generation/templates/mini.docx
@@ -38,7 +38,7 @@
             <w:tblPr>
               <w:tblStyle w:val="TableGrid"/>
               <w:tblpPr w:leftFromText="187" w:rightFromText="187" w:vertAnchor="text" w:tblpXSpec="center" w:tblpY="1"/>
-              <w:tblW w:w="2137" w:type="dxa"/>
+              <w:tblW w:w="2160" w:type="dxa"/>
               <w:tblCellMar>
                 <w:left w:w="0" w:type="dxa"/>
                 <w:right w:w="0" w:type="dxa"/>
@@ -46,7 +46,7 @@
               <w:tblLook w:val="04A0" w:firstRow="1" w:lastRow="0" w:firstColumn="1" w:lastColumn="0" w:noHBand="0" w:noVBand="1"/>
             </w:tblPr>
             <w:tblGrid>
-              <w:gridCol w:w="2137"/>
+              <w:gridCol w:w="2160"/>
             </w:tblGrid>
             <w:tr>
               <w:trPr>
@@ -245,48 +245,26 @@
               </w:tc>
             </w:tr>
           </w:tbl>
-          <w:tbl>
-            <w:tblPr>
-              <w:tblStyle w:val="TableGrid"/>
-              <w:tblW w:w="0" w:type="auto"/>
+          <w:p>
+            <w:pPr>
+              <w:spacing w:before="60" w:after="60" w:line="278" w:lineRule="auto"/>
               <w:jc w:val="center"/>
-              <w:tblLook w:val="04A0" w:firstRow="1" w:lastRow="0" w:firstColumn="1" w:lastColumn="0" w:noHBand="0" w:noVBand="1"/>
-            </w:tblPr>
-            <w:tblGrid>
-              <w:gridCol w:w="2120"/>
-            </w:tblGrid>
-            <w:tr>
-              <w:trPr>
-                <w:jc w:val="center"/>
-              </w:trPr>
-              <w:tc>
-                <w:tcPr>
-                  <w:tcW w:w="2120" w:type="dxa"/>
-                  <w:vAlign w:val="center"/>
-                </w:tcPr>
-                <w:p>
-                  <w:pPr>
-                    <w:framePr w:wrap="around" w:hAnchor="margin" w:xAlign="center" w:y="303"/>
-                    <w:suppressOverlap/>
-                    <w:rPr>
-                      <w:sz w:val="2"/>
-                      <w:szCs w:val="2"/>
-                    </w:rPr>
-                  </w:pPr>
-                  <w:r>
-                    <w:rPr>
-                      <w:rFonts w:ascii="Arial" w:hAnsi="Arial" w:cs="Arial"/>
-                      <w:b/>
-                      <w:bCs/>
-                      <w:sz w:val="16"/>
-                      <w:szCs w:val="16"/>
-                    </w:rPr>
-                    <w:t>{{Label1.ProductBrand}}</w:t>
-                  </w:r>
-                </w:p>
-              </w:tc>
-            </w:tr>
-          </w:tbl>
+              <w:rPr>
+                <w:sz w:val="2"/>
+                <w:szCs w:val="2"/>
+              </w:rPr>
+            </w:pPr>
+            <w:r>
+              <w:rPr>
+                <w:rFonts w:ascii="Arial" w:hAnsi="Arial" w:cs="Arial"/>
+                <w:b/>
+                <w:bCs/>
+                <w:sz w:val="16"/>
+                <w:szCs w:val="16"/>
+              </w:rPr>
+              <w:t>{{Label1.ProductBrand}}</w:t>
+            </w:r>
+          </w:p>
           <w:p>
             <w:pPr>
               <w:rPr>

</xml_diff>